<commit_message>
Update yolo11m with attention (CBAM)
</commit_message>
<xml_diff>
--- a/HW2/hw2_314706007/report_314706007.docx
+++ b/HW2/hw2_314706007/report_314706007.docx
@@ -2,7 +2,797 @@
 <file path=word/document.xml><?xml version="1.0" encoding="utf-8"?>
 <w:document xmlns:wpc="http://schemas.microsoft.com/office/word/2010/wordprocessingCanvas" xmlns:cx="http://schemas.microsoft.com/office/drawing/2014/chartex" xmlns:cx1="http://schemas.microsoft.com/office/drawing/2015/9/8/chartex" xmlns:cx2="http://schemas.microsoft.com/office/drawing/2015/10/21/chartex" xmlns:cx3="http://schemas.microsoft.com/office/drawing/2016/5/9/chartex" xmlns:cx4="http://schemas.microsoft.com/office/drawing/2016/5/10/chartex" xmlns:cx5="http://schemas.microsoft.com/office/drawing/2016/5/11/chartex" xmlns:cx6="http://schemas.microsoft.com/office/drawing/2016/5/12/chartex" xmlns:cx7="http://schemas.microsoft.com/office/drawing/2016/5/13/chartex" xmlns:cx8="http://schemas.microsoft.com/office/drawing/2016/5/14/chartex" xmlns:mc="http://schemas.openxmlformats.org/markup-compatibility/2006" xmlns:aink="http://schemas.microsoft.com/office/drawing/2016/ink" xmlns:am3d="http://schemas.microsoft.com/office/drawing/2017/model3d" xmlns:o="urn:schemas-microsoft-com:office:office" xmlns:oel="http://schemas.microsoft.com/office/2019/extlst" xmlns:r="http://schemas.openxmlformats.org/officeDocument/2006/relationships" xmlns:m="http://schemas.openxmlformats.org/officeDocument/2006/math" xmlns:v="urn:schemas-microsoft-com:vml" xmlns:wp14="http://schemas.microsoft.com/office/word/2010/wordprocessingDrawing" xmlns:wp="http://schemas.openxmlformats.org/drawingml/2006/wordprocessingDrawing" xmlns:w10="urn:schemas-microsoft-com:office:word" xmlns:w="http://schemas.openxmlformats.org/wordprocessingml/2006/main" xmlns:w14="http://schemas.microsoft.com/office/word/2010/wordml" xmlns:w15="http://schemas.microsoft.com/office/word/2012/wordml" xmlns:w16cex="http://schemas.microsoft.com/office/word/2018/wordml/cex" xmlns:w16cid="http://schemas.microsoft.com/office/word/2016/wordml/cid" xmlns:w16="http://schemas.microsoft.com/office/word/2018/wordml" xmlns:w16du="http://schemas.microsoft.com/office/word/2023/wordml/word16du" xmlns:w16sdtdh="http://schemas.microsoft.com/office/word/2020/wordml/sdtdatahash" xmlns:w16sdtfl="http://schemas.microsoft.com/office/word/2024/wordml/sdtformatlock" xmlns:w16se="http://schemas.microsoft.com/office/word/2015/wordml/symex" xmlns:wpg="http://schemas.microsoft.com/office/word/2010/wordprocessingGroup" xmlns:wpi="http://schemas.microsoft.com/office/word/2010/wordprocessingInk" xmlns:wne="http://schemas.microsoft.com/office/word/2006/wordml" xmlns:wps="http://schemas.microsoft.com/office/word/2010/wordprocessingShape" mc:Ignorable="w14 w15 w16se w16cid w16 w16cex w16sdtdh w16sdtfl w16du wp14">
   <w:body>
-    <w:p/>
+    <w:p>
+      <w:pPr>
+        <w:rPr>
+          <w:b/>
+          <w:bCs/>
+          <w:lang w:val="en-US"/>
+        </w:rPr>
+      </w:pPr>
+      <w:r>
+        <w:rPr>
+          <w:b/>
+          <w:bCs/>
+          <w:lang w:val="en-US"/>
+        </w:rPr>
+        <w:t>Baseline</w:t>
+      </w:r>
+    </w:p>
+    <w:p>
+      <w:pPr>
+        <w:ind w:leftChars="100" w:left="240"/>
+        <w:rPr>
+          <w:lang w:val="en-US"/>
+        </w:rPr>
+      </w:pPr>
+      <w:r>
+        <w:rPr>
+          <w:lang w:val="en-US"/>
+        </w:rPr>
+        <w:t>Log:</w:t>
+      </w:r>
+    </w:p>
+    <w:p>
+      <w:pPr>
+        <w:ind w:leftChars="100" w:left="240" w:firstLine="480"/>
+        <w:rPr>
+          <w:lang w:val="en-US"/>
+        </w:rPr>
+      </w:pPr>
+      <w:r>
+        <w:rPr>
+          <w:lang w:val="en-US"/>
+        </w:rPr>
+        <w:t>Yolo11s:</w:t>
+      </w:r>
+    </w:p>
+    <w:p>
+      <w:pPr>
+        <w:pStyle w:val="ListParagraph"/>
+        <w:numPr>
+          <w:ilvl w:val="0"/>
+          <w:numId w:val="1"/>
+        </w:numPr>
+        <w:ind w:leftChars="400" w:left="1440"/>
+        <w:rPr>
+          <w:lang w:val="en-US"/>
+        </w:rPr>
+      </w:pPr>
+      <w:r>
+        <w:rPr>
+          <w:lang w:val="en-US"/>
+        </w:rPr>
+        <w:t xml:space="preserve">First run: SEED </w:t>
+      </w:r>
+      <w:proofErr w:type="gramStart"/>
+      <w:r>
+        <w:rPr>
+          <w:lang w:val="en-US"/>
+        </w:rPr>
+        <w:t>= ?</w:t>
+      </w:r>
+      <w:bookmarkStart w:id="0" w:name="_Hlk212032054"/>
+      <w:proofErr w:type="gramEnd"/>
+    </w:p>
+    <w:p>
+      <w:pPr>
+        <w:pStyle w:val="ListParagraph"/>
+        <w:numPr>
+          <w:ilvl w:val="0"/>
+          <w:numId w:val="1"/>
+        </w:numPr>
+        <w:ind w:leftChars="400" w:left="1440"/>
+        <w:rPr>
+          <w:lang w:val="en-US"/>
+        </w:rPr>
+      </w:pPr>
+      <w:r>
+        <w:rPr>
+          <w:lang w:val="en-US"/>
+        </w:rPr>
+        <w:t>Second run: SEED = 42</w:t>
+      </w:r>
+      <w:bookmarkEnd w:id="0"/>
+    </w:p>
+    <w:p>
+      <w:pPr>
+        <w:pStyle w:val="ListParagraph"/>
+        <w:numPr>
+          <w:ilvl w:val="0"/>
+          <w:numId w:val="1"/>
+        </w:numPr>
+        <w:ind w:leftChars="400" w:left="1440"/>
+        <w:rPr>
+          <w:lang w:val="en-US"/>
+        </w:rPr>
+      </w:pPr>
+      <w:r>
+        <w:rPr>
+          <w:lang w:val="en-US"/>
+        </w:rPr>
+        <w:t>Third run: SEED = 42</w:t>
+      </w:r>
+    </w:p>
+    <w:p>
+      <w:pPr>
+        <w:pStyle w:val="ListParagraph"/>
+        <w:numPr>
+          <w:ilvl w:val="0"/>
+          <w:numId w:val="1"/>
+        </w:numPr>
+        <w:ind w:leftChars="400" w:left="1440"/>
+        <w:rPr>
+          <w:lang w:val="en-US"/>
+        </w:rPr>
+      </w:pPr>
+      <w:proofErr w:type="spellStart"/>
+      <w:r>
+        <w:rPr>
+          <w:lang w:val="en-US"/>
+        </w:rPr>
+        <w:t>Forth</w:t>
+      </w:r>
+      <w:proofErr w:type="spellEnd"/>
+      <w:r>
+        <w:rPr>
+          <w:lang w:val="en-US"/>
+        </w:rPr>
+        <w:t xml:space="preserve"> run: SEED = 42</w:t>
+      </w:r>
+    </w:p>
+    <w:p>
+      <w:pPr>
+        <w:pStyle w:val="ListParagraph"/>
+        <w:numPr>
+          <w:ilvl w:val="0"/>
+          <w:numId w:val="1"/>
+        </w:numPr>
+        <w:ind w:leftChars="400" w:left="1440"/>
+        <w:rPr>
+          <w:lang w:val="en-US"/>
+        </w:rPr>
+      </w:pPr>
+      <w:r>
+        <w:rPr>
+          <w:lang w:val="en-US"/>
+        </w:rPr>
+        <w:t>Fifth run: SEED = 11</w:t>
+      </w:r>
+    </w:p>
+    <w:p>
+      <w:pPr>
+        <w:pStyle w:val="ListParagraph"/>
+        <w:numPr>
+          <w:ilvl w:val="0"/>
+          <w:numId w:val="1"/>
+        </w:numPr>
+        <w:ind w:leftChars="400" w:left="1440"/>
+        <w:rPr>
+          <w:lang w:val="en-US"/>
+        </w:rPr>
+      </w:pPr>
+      <w:r>
+        <w:rPr>
+          <w:lang w:val="en-US"/>
+        </w:rPr>
+        <w:t xml:space="preserve">Sixth run: fix the annotation problem, which I previously combine all labels in one line, causing only one bounding box for each </w:t>
+      </w:r>
+      <w:proofErr w:type="spellStart"/>
+      <w:r>
+        <w:rPr>
+          <w:lang w:val="en-US"/>
+        </w:rPr>
+        <w:t>img</w:t>
+      </w:r>
+      <w:proofErr w:type="spellEnd"/>
+      <w:r>
+        <w:rPr>
+          <w:lang w:val="en-US"/>
+        </w:rPr>
+        <w:t>. Fix code by adding new line</w:t>
+      </w:r>
+      <w:r>
+        <w:rPr>
+          <w:lang w:val="en-US"/>
+        </w:rPr>
+        <w:t xml:space="preserve"> in annotation</w:t>
+      </w:r>
+      <w:r>
+        <w:rPr>
+          <w:lang w:val="en-US"/>
+        </w:rPr>
+        <w:t>.</w:t>
+      </w:r>
+      <w:r>
+        <w:rPr>
+          <w:lang w:val="en-US"/>
+        </w:rPr>
+        <w:t xml:space="preserve"> </w:t>
+      </w:r>
+    </w:p>
+    <w:p>
+      <w:pPr>
+        <w:jc w:val="right"/>
+        <w:rPr>
+          <w:lang w:val="en-US"/>
+        </w:rPr>
+      </w:pPr>
+    </w:p>
+    <w:p>
+      <w:pPr>
+        <w:rPr>
+          <w:b/>
+          <w:bCs/>
+          <w:lang w:val="en-US"/>
+        </w:rPr>
+      </w:pPr>
+      <w:r>
+        <w:rPr>
+          <w:b/>
+          <w:bCs/>
+          <w:lang w:val="en-US"/>
+        </w:rPr>
+        <w:t>TODO:</w:t>
+      </w:r>
+    </w:p>
+    <w:p>
+      <w:pPr>
+        <w:pStyle w:val="ListParagraph"/>
+        <w:numPr>
+          <w:ilvl w:val="0"/>
+          <w:numId w:val="2"/>
+        </w:numPr>
+        <w:rPr>
+          <w:lang w:val="en-US"/>
+        </w:rPr>
+      </w:pPr>
+      <w:r>
+        <w:rPr>
+          <w:lang w:val="en-US"/>
+        </w:rPr>
+        <w:t>Try different models or hybrid method</w:t>
+      </w:r>
+    </w:p>
+    <w:p>
+      <w:pPr>
+        <w:pStyle w:val="ListParagraph"/>
+        <w:numPr>
+          <w:ilvl w:val="0"/>
+          <w:numId w:val="2"/>
+        </w:numPr>
+        <w:rPr>
+          <w:strike/>
+          <w:lang w:val="en-US"/>
+        </w:rPr>
+      </w:pPr>
+      <w:r>
+        <w:rPr>
+          <w:strike/>
+          <w:lang w:val="en-US"/>
+        </w:rPr>
+        <w:t>Count IR</w:t>
+      </w:r>
+    </w:p>
+    <w:p>
+      <w:pPr>
+        <w:pStyle w:val="ListParagraph"/>
+        <w:numPr>
+          <w:ilvl w:val="0"/>
+          <w:numId w:val="2"/>
+        </w:numPr>
+        <w:rPr>
+          <w:strike/>
+          <w:lang w:val="en-US"/>
+        </w:rPr>
+      </w:pPr>
+      <w:r>
+        <w:rPr>
+          <w:strike/>
+          <w:lang w:val="en-US"/>
+        </w:rPr>
+        <w:t xml:space="preserve">Simple </w:t>
+      </w:r>
+      <w:proofErr w:type="spellStart"/>
+      <w:r>
+        <w:rPr>
+          <w:strike/>
+          <w:lang w:val="en-US"/>
+        </w:rPr>
+        <w:t>undersampling</w:t>
+      </w:r>
+      <w:proofErr w:type="spellEnd"/>
+      <w:r>
+        <w:rPr>
+          <w:strike/>
+          <w:lang w:val="en-US"/>
+        </w:rPr>
+        <w:t xml:space="preserve"> and oversampling</w:t>
+      </w:r>
+    </w:p>
+    <w:p>
+      <w:pPr>
+        <w:pStyle w:val="ListParagraph"/>
+        <w:numPr>
+          <w:ilvl w:val="0"/>
+          <w:numId w:val="2"/>
+        </w:numPr>
+        <w:rPr>
+          <w:strike/>
+          <w:lang w:val="en-US"/>
+        </w:rPr>
+      </w:pPr>
+      <w:r>
+        <w:rPr>
+          <w:strike/>
+          <w:lang w:val="en-US"/>
+        </w:rPr>
+        <w:t>Re-weighting</w:t>
+      </w:r>
+      <w:r>
+        <w:rPr>
+          <w:strike/>
+          <w:lang w:val="en-US"/>
+        </w:rPr>
+        <w:t xml:space="preserve"> both on feature exactor and </w:t>
+      </w:r>
+      <w:r>
+        <w:rPr>
+          <w:strike/>
+          <w:lang w:val="en-US"/>
+        </w:rPr>
+        <w:t>classifier</w:t>
+      </w:r>
+    </w:p>
+    <w:p>
+      <w:pPr>
+        <w:pStyle w:val="ListParagraph"/>
+        <w:numPr>
+          <w:ilvl w:val="0"/>
+          <w:numId w:val="2"/>
+        </w:numPr>
+        <w:rPr>
+          <w:strike/>
+          <w:lang w:val="en-US"/>
+        </w:rPr>
+      </w:pPr>
+      <w:r>
+        <w:rPr>
+          <w:strike/>
+          <w:lang w:val="en-US"/>
+        </w:rPr>
+        <w:t xml:space="preserve">Re-weighting only on </w:t>
+      </w:r>
+      <w:r>
+        <w:rPr>
+          <w:strike/>
+          <w:lang w:val="en-US"/>
+        </w:rPr>
+        <w:t>classifier</w:t>
+      </w:r>
+    </w:p>
+    <w:p>
+      <w:pPr>
+        <w:pStyle w:val="ListParagraph"/>
+        <w:numPr>
+          <w:ilvl w:val="0"/>
+          <w:numId w:val="2"/>
+        </w:numPr>
+        <w:rPr>
+          <w:lang w:val="en-US"/>
+        </w:rPr>
+      </w:pPr>
+      <w:r>
+        <w:rPr>
+          <w:lang w:val="en-US"/>
+        </w:rPr>
+        <w:t>Combine method</w:t>
+      </w:r>
+      <w:r>
+        <w:rPr>
+          <w:lang w:val="en-US"/>
+        </w:rPr>
+        <w:t xml:space="preserve"> </w:t>
+      </w:r>
+    </w:p>
+    <w:p>
+      <w:pPr>
+        <w:pStyle w:val="ListParagraph"/>
+        <w:numPr>
+          <w:ilvl w:val="0"/>
+          <w:numId w:val="2"/>
+        </w:numPr>
+        <w:rPr>
+          <w:lang w:val="en-US"/>
+        </w:rPr>
+      </w:pPr>
+      <w:r>
+        <w:rPr>
+          <w:lang w:val="en-US"/>
+        </w:rPr>
+        <w:t>Add attention mechanism to yolo structure (CBAM)</w:t>
+      </w:r>
+    </w:p>
+    <w:p>
+      <w:pPr>
+        <w:pStyle w:val="ListParagraph"/>
+        <w:numPr>
+          <w:ilvl w:val="0"/>
+          <w:numId w:val="2"/>
+        </w:numPr>
+        <w:rPr>
+          <w:lang w:val="en-US"/>
+        </w:rPr>
+      </w:pPr>
+      <w:r>
+        <w:rPr>
+          <w:lang w:val="en-US"/>
+        </w:rPr>
+        <w:t>Try transformer structure (DETR)</w:t>
+      </w:r>
+    </w:p>
+    <w:p>
+      <w:pPr>
+        <w:rPr>
+          <w:lang w:val="en-US"/>
+        </w:rPr>
+      </w:pPr>
+    </w:p>
+    <w:p>
+      <w:pPr>
+        <w:rPr>
+          <w:b/>
+          <w:bCs/>
+          <w:lang w:val="en-US"/>
+        </w:rPr>
+      </w:pPr>
+      <w:r>
+        <w:rPr>
+          <w:b/>
+          <w:bCs/>
+          <w:lang w:val="en-US"/>
+        </w:rPr>
+        <w:t>Re-balance:</w:t>
+      </w:r>
+    </w:p>
+    <w:p>
+      <w:pPr>
+        <w:rPr>
+          <w:lang w:val="en-US"/>
+        </w:rPr>
+      </w:pPr>
+      <w:r>
+        <w:rPr>
+          <w:b/>
+          <w:bCs/>
+          <w:lang w:val="en-US"/>
+        </w:rPr>
+        <w:tab/>
+      </w:r>
+      <w:r>
+        <w:rPr>
+          <w:lang w:val="en-US"/>
+        </w:rPr>
+        <w:t>Log:</w:t>
+      </w:r>
+    </w:p>
+    <w:p>
+      <w:pPr>
+        <w:pStyle w:val="ListParagraph"/>
+        <w:numPr>
+          <w:ilvl w:val="0"/>
+          <w:numId w:val="3"/>
+        </w:numPr>
+        <w:rPr>
+          <w:lang w:val="en-US"/>
+        </w:rPr>
+      </w:pPr>
+      <w:r>
+        <w:rPr>
+          <w:lang w:val="en-US"/>
+        </w:rPr>
+        <w:t>Second Run: Reweighting barely effects the result. This is due to yolo count loss with</w:t>
+      </w:r>
+      <w:r>
+        <w:rPr>
+          <w:lang w:val="en-US"/>
+        </w:rPr>
+        <w:t xml:space="preserve"> 7.5 for boxes</w:t>
+      </w:r>
+      <w:r>
+        <w:rPr>
+          <w:lang w:val="en-US"/>
+        </w:rPr>
+        <w:t xml:space="preserve"> loss</w:t>
+      </w:r>
+      <w:r>
+        <w:rPr>
+          <w:lang w:val="en-US"/>
+        </w:rPr>
+        <w:t xml:space="preserve">, 0.5 for </w:t>
+      </w:r>
+      <w:proofErr w:type="spellStart"/>
+      <w:r>
+        <w:rPr>
+          <w:lang w:val="en-US"/>
+        </w:rPr>
+        <w:t>cls</w:t>
+      </w:r>
+      <w:proofErr w:type="spellEnd"/>
+      <w:r>
+        <w:rPr>
+          <w:lang w:val="en-US"/>
+        </w:rPr>
+        <w:t xml:space="preserve"> loss</w:t>
+      </w:r>
+      <w:r>
+        <w:rPr>
+          <w:lang w:val="en-US"/>
+        </w:rPr>
+        <w:t xml:space="preserve">, 1.5 for </w:t>
+      </w:r>
+      <w:proofErr w:type="spellStart"/>
+      <w:r>
+        <w:rPr>
+          <w:lang w:val="en-US"/>
+        </w:rPr>
+        <w:t>dfl</w:t>
+      </w:r>
+      <w:proofErr w:type="spellEnd"/>
+      <w:r>
+        <w:rPr>
+          <w:lang w:val="en-US"/>
+        </w:rPr>
+        <w:t xml:space="preserve"> loss.</w:t>
+      </w:r>
+    </w:p>
+    <w:p>
+      <w:pPr>
+        <w:pStyle w:val="ListParagraph"/>
+        <w:numPr>
+          <w:ilvl w:val="0"/>
+          <w:numId w:val="3"/>
+        </w:numPr>
+        <w:rPr>
+          <w:lang w:val="en-US"/>
+        </w:rPr>
+      </w:pPr>
+      <w:r>
+        <w:rPr>
+          <w:lang w:val="en-US"/>
+        </w:rPr>
+        <w:t xml:space="preserve">Third Run: Adjust </w:t>
+      </w:r>
+      <w:proofErr w:type="spellStart"/>
+      <w:r>
+        <w:rPr>
+          <w:lang w:val="en-US"/>
+        </w:rPr>
+        <w:t>cls</w:t>
+      </w:r>
+      <w:proofErr w:type="spellEnd"/>
+      <w:r>
+        <w:rPr>
+          <w:lang w:val="en-US"/>
+        </w:rPr>
+        <w:t xml:space="preserve"> loss to 2.0, for a significant effect on class-weighted loss</w:t>
+      </w:r>
+      <w:r>
+        <w:rPr>
+          <w:lang w:val="en-US"/>
+        </w:rPr>
+        <w:t>. Found resampling only has the best result</w:t>
+      </w:r>
+      <w:r>
+        <w:rPr>
+          <w:noProof/>
+          <w:lang w:val="en-US"/>
+        </w:rPr>
+        <w:drawing>
+          <wp:inline distT="0" distB="0" distL="0" distR="0" wp14:anchorId="1FB734E1" wp14:editId="22A772E4">
+            <wp:extent cx="5943600" cy="1737995"/>
+            <wp:effectExtent l="0" t="0" r="0" b="1905"/>
+            <wp:docPr id="1679022329" name="Picture 1" descr="A screenshot of a black screen&#10;&#10;AI-generated content may be incorrect."/>
+            <wp:cNvGraphicFramePr>
+              <a:graphicFrameLocks xmlns:a="http://schemas.openxmlformats.org/drawingml/2006/main" noChangeAspect="1"/>
+            </wp:cNvGraphicFramePr>
+            <a:graphic xmlns:a="http://schemas.openxmlformats.org/drawingml/2006/main">
+              <a:graphicData uri="http://schemas.openxmlformats.org/drawingml/2006/picture">
+                <pic:pic xmlns:pic="http://schemas.openxmlformats.org/drawingml/2006/picture">
+                  <pic:nvPicPr>
+                    <pic:cNvPr id="1679022329" name="Picture 1" descr="A screenshot of a black screen&#10;&#10;AI-generated content may be incorrect."/>
+                    <pic:cNvPicPr/>
+                  </pic:nvPicPr>
+                  <pic:blipFill>
+                    <a:blip r:embed="rId5" cstate="print">
+                      <a:extLst>
+                        <a:ext uri="{28A0092B-C50C-407E-A947-70E740481C1C}">
+                          <a14:useLocalDpi xmlns:a14="http://schemas.microsoft.com/office/drawing/2010/main" val="0"/>
+                        </a:ext>
+                      </a:extLst>
+                    </a:blip>
+                    <a:stretch>
+                      <a:fillRect/>
+                    </a:stretch>
+                  </pic:blipFill>
+                  <pic:spPr>
+                    <a:xfrm>
+                      <a:off x="0" y="0"/>
+                      <a:ext cx="5943600" cy="1737995"/>
+                    </a:xfrm>
+                    <a:prstGeom prst="rect">
+                      <a:avLst/>
+                    </a:prstGeom>
+                  </pic:spPr>
+                </pic:pic>
+              </a:graphicData>
+            </a:graphic>
+          </wp:inline>
+        </w:drawing>
+      </w:r>
+    </w:p>
+    <w:p>
+      <w:pPr>
+        <w:pStyle w:val="ListParagraph"/>
+        <w:ind w:left="1920"/>
+        <w:rPr>
+          <w:lang w:val="en-US"/>
+        </w:rPr>
+      </w:pPr>
+      <w:r>
+        <w:rPr>
+          <w:highlight w:val="yellow"/>
+          <w:lang w:val="en-US"/>
+        </w:rPr>
+        <w:t xml:space="preserve">Best method: resampling only - oversample long tail data and </w:t>
+      </w:r>
+      <w:proofErr w:type="spellStart"/>
+      <w:r>
+        <w:rPr>
+          <w:highlight w:val="yellow"/>
+          <w:lang w:val="en-US"/>
+        </w:rPr>
+        <w:t>undersample</w:t>
+      </w:r>
+      <w:proofErr w:type="spellEnd"/>
+      <w:r>
+        <w:rPr>
+          <w:highlight w:val="yellow"/>
+          <w:lang w:val="en-US"/>
+        </w:rPr>
+        <w:t xml:space="preserve"> head data</w:t>
+      </w:r>
+    </w:p>
+    <w:p>
+      <w:pPr>
+        <w:pStyle w:val="ListParagraph"/>
+        <w:ind w:left="1920"/>
+        <w:rPr>
+          <w:lang w:val="en-US"/>
+        </w:rPr>
+      </w:pPr>
+    </w:p>
+    <w:p>
+      <w:pPr>
+        <w:pStyle w:val="ListParagraph"/>
+        <w:numPr>
+          <w:ilvl w:val="0"/>
+          <w:numId w:val="3"/>
+        </w:numPr>
+        <w:rPr>
+          <w:lang w:val="en-US"/>
+        </w:rPr>
+      </w:pPr>
+      <w:proofErr w:type="spellStart"/>
+      <w:r>
+        <w:rPr>
+          <w:lang w:val="en-US"/>
+        </w:rPr>
+        <w:t>Forth</w:t>
+      </w:r>
+      <w:proofErr w:type="spellEnd"/>
+      <w:r>
+        <w:rPr>
+          <w:lang w:val="en-US"/>
+        </w:rPr>
+        <w:t xml:space="preserve"> Run: YOLO11m with resampling for 30 epoch, batch 16, </w:t>
+      </w:r>
+      <w:proofErr w:type="spellStart"/>
+      <w:r>
+        <w:rPr>
+          <w:lang w:val="en-US"/>
+        </w:rPr>
+        <w:t>imgsz</w:t>
+      </w:r>
+      <w:proofErr w:type="spellEnd"/>
+      <w:r>
+        <w:rPr>
+          <w:lang w:val="en-US"/>
+        </w:rPr>
+        <w:t xml:space="preserve"> 640</w:t>
+      </w:r>
+      <w:r>
+        <w:rPr>
+          <w:lang w:val="en-US"/>
+        </w:rPr>
+        <w:t xml:space="preserve">; Result: 0.202 </w:t>
+      </w:r>
+    </w:p>
+    <w:p>
+      <w:pPr>
+        <w:ind w:left="1440"/>
+        <w:rPr>
+          <w:lang w:val="en-US"/>
+        </w:rPr>
+      </w:pPr>
+    </w:p>
+    <w:p>
+      <w:pPr>
+        <w:rPr>
+          <w:b/>
+          <w:bCs/>
+          <w:lang w:val="en-US"/>
+        </w:rPr>
+      </w:pPr>
+      <w:r>
+        <w:rPr>
+          <w:b/>
+          <w:bCs/>
+          <w:lang w:val="en-US"/>
+        </w:rPr>
+        <w:lastRenderedPageBreak/>
+        <w:t>Attention (CBAM)</w:t>
+      </w:r>
+    </w:p>
+    <w:p>
+      <w:pPr>
+        <w:rPr>
+          <w:lang w:val="en-US"/>
+        </w:rPr>
+      </w:pPr>
+      <w:r>
+        <w:rPr>
+          <w:b/>
+          <w:bCs/>
+          <w:lang w:val="en-US"/>
+        </w:rPr>
+        <w:tab/>
+      </w:r>
+      <w:r>
+        <w:rPr>
+          <w:lang w:val="en-US"/>
+        </w:rPr>
+        <w:t>Log:</w:t>
+      </w:r>
+    </w:p>
+    <w:p>
+      <w:pPr>
+        <w:rPr>
+          <w:lang w:val="en-US"/>
+        </w:rPr>
+      </w:pPr>
+    </w:p>
+    <w:p>
+      <w:pPr>
+        <w:rPr>
+          <w:lang w:val="en-US"/>
+        </w:rPr>
+      </w:pPr>
+    </w:p>
+    <w:p>
+      <w:pPr>
+        <w:ind w:firstLine="720"/>
+        <w:rPr>
+          <w:lang w:val="en-US"/>
+        </w:rPr>
+      </w:pPr>
+      <w:r>
+        <w:rPr>
+          <w:lang w:val="en-US"/>
+        </w:rPr>
+        <w:t>Try classifier with and without attention</w:t>
+      </w:r>
+    </w:p>
     <w:sectPr>
       <w:pgSz w:w="12240" w:h="15840"/>
       <w:pgMar w:top="1440" w:right="1440" w:bottom="1440" w:left="1440" w:header="708" w:footer="708" w:gutter="0"/>
@@ -11,6 +801,332 @@
     </w:sectPr>
   </w:body>
 </w:document>
+</file>
+
+<file path=word/numbering.xml><?xml version="1.0" encoding="utf-8"?>
+<w:numbering xmlns:wpc="http://schemas.microsoft.com/office/word/2010/wordprocessingCanvas" xmlns:cx="http://schemas.microsoft.com/office/drawing/2014/chartex" xmlns:cx1="http://schemas.microsoft.com/office/drawing/2015/9/8/chartex" xmlns:cx2="http://schemas.microsoft.com/office/drawing/2015/10/21/chartex" xmlns:cx3="http://schemas.microsoft.com/office/drawing/2016/5/9/chartex" xmlns:cx4="http://schemas.microsoft.com/office/drawing/2016/5/10/chartex" xmlns:cx5="http://schemas.microsoft.com/office/drawing/2016/5/11/chartex" xmlns:cx6="http://schemas.microsoft.com/office/drawing/2016/5/12/chartex" xmlns:cx7="http://schemas.microsoft.com/office/drawing/2016/5/13/chartex" xmlns:cx8="http://schemas.microsoft.com/office/drawing/2016/5/14/chartex" xmlns:mc="http://schemas.openxmlformats.org/markup-compatibility/2006" xmlns:aink="http://schemas.microsoft.com/office/drawing/2016/ink" xmlns:am3d="http://schemas.microsoft.com/office/drawing/2017/model3d" xmlns:o="urn:schemas-microsoft-com:office:office" xmlns:oel="http://schemas.microsoft.com/office/2019/extlst" xmlns:r="http://schemas.openxmlformats.org/officeDocument/2006/relationships" xmlns:m="http://schemas.openxmlformats.org/officeDocument/2006/math" xmlns:v="urn:schemas-microsoft-com:vml" xmlns:wp14="http://schemas.microsoft.com/office/word/2010/wordprocessingDrawing" xmlns:wp="http://schemas.openxmlformats.org/drawingml/2006/wordprocessingDrawing" xmlns:w10="urn:schemas-microsoft-com:office:word" xmlns:w="http://schemas.openxmlformats.org/wordprocessingml/2006/main" xmlns:w14="http://schemas.microsoft.com/office/word/2010/wordml" xmlns:w15="http://schemas.microsoft.com/office/word/2012/wordml" xmlns:w16cex="http://schemas.microsoft.com/office/word/2018/wordml/cex" xmlns:w16cid="http://schemas.microsoft.com/office/word/2016/wordml/cid" xmlns:w16="http://schemas.microsoft.com/office/word/2018/wordml" xmlns:w16du="http://schemas.microsoft.com/office/word/2023/wordml/word16du" xmlns:w16sdtdh="http://schemas.microsoft.com/office/word/2020/wordml/sdtdatahash" xmlns:w16sdtfl="http://schemas.microsoft.com/office/word/2024/wordml/sdtformatlock" xmlns:w16se="http://schemas.microsoft.com/office/word/2015/wordml/symex" xmlns:wpg="http://schemas.microsoft.com/office/word/2010/wordprocessingGroup" xmlns:wpi="http://schemas.microsoft.com/office/word/2010/wordprocessingInk" xmlns:wne="http://schemas.microsoft.com/office/word/2006/wordml" xmlns:wps="http://schemas.microsoft.com/office/word/2010/wordprocessingShape" mc:Ignorable="w14 w15 w16se w16cid w16 w16cex w16sdtdh w16sdtfl w16du wp14">
+  <w:abstractNum w:abstractNumId="0" w15:restartNumberingAfterBreak="0">
+    <w:nsid w:val="0E9237AB"/>
+    <w:multiLevelType w:val="hybridMultilevel"/>
+    <w:tmpl w:val="C0669726"/>
+    <w:lvl w:ilvl="0" w:tplc="04090001">
+      <w:start w:val="1"/>
+      <w:numFmt w:val="bullet"/>
+      <w:lvlText w:val=""/>
+      <w:lvlJc w:val="left"/>
+      <w:pPr>
+        <w:ind w:left="1920" w:hanging="480"/>
+      </w:pPr>
+      <w:rPr>
+        <w:rFonts w:ascii="Wingdings" w:hAnsi="Wingdings" w:hint="default"/>
+      </w:rPr>
+    </w:lvl>
+    <w:lvl w:ilvl="1" w:tplc="04090003">
+      <w:start w:val="1"/>
+      <w:numFmt w:val="bullet"/>
+      <w:lvlText w:val=""/>
+      <w:lvlJc w:val="left"/>
+      <w:pPr>
+        <w:ind w:left="2400" w:hanging="480"/>
+      </w:pPr>
+      <w:rPr>
+        <w:rFonts w:ascii="Wingdings" w:hAnsi="Wingdings" w:hint="default"/>
+      </w:rPr>
+    </w:lvl>
+    <w:lvl w:ilvl="2" w:tplc="04090005">
+      <w:start w:val="1"/>
+      <w:numFmt w:val="bullet"/>
+      <w:lvlText w:val=""/>
+      <w:lvlJc w:val="left"/>
+      <w:pPr>
+        <w:ind w:left="2880" w:hanging="480"/>
+      </w:pPr>
+      <w:rPr>
+        <w:rFonts w:ascii="Wingdings" w:hAnsi="Wingdings" w:hint="default"/>
+      </w:rPr>
+    </w:lvl>
+    <w:lvl w:ilvl="3" w:tplc="04090001" w:tentative="1">
+      <w:start w:val="1"/>
+      <w:numFmt w:val="bullet"/>
+      <w:lvlText w:val=""/>
+      <w:lvlJc w:val="left"/>
+      <w:pPr>
+        <w:ind w:left="3360" w:hanging="480"/>
+      </w:pPr>
+      <w:rPr>
+        <w:rFonts w:ascii="Wingdings" w:hAnsi="Wingdings" w:hint="default"/>
+      </w:rPr>
+    </w:lvl>
+    <w:lvl w:ilvl="4" w:tplc="04090003" w:tentative="1">
+      <w:start w:val="1"/>
+      <w:numFmt w:val="bullet"/>
+      <w:lvlText w:val=""/>
+      <w:lvlJc w:val="left"/>
+      <w:pPr>
+        <w:ind w:left="3840" w:hanging="480"/>
+      </w:pPr>
+      <w:rPr>
+        <w:rFonts w:ascii="Wingdings" w:hAnsi="Wingdings" w:hint="default"/>
+      </w:rPr>
+    </w:lvl>
+    <w:lvl w:ilvl="5" w:tplc="04090005" w:tentative="1">
+      <w:start w:val="1"/>
+      <w:numFmt w:val="bullet"/>
+      <w:lvlText w:val=""/>
+      <w:lvlJc w:val="left"/>
+      <w:pPr>
+        <w:ind w:left="4320" w:hanging="480"/>
+      </w:pPr>
+      <w:rPr>
+        <w:rFonts w:ascii="Wingdings" w:hAnsi="Wingdings" w:hint="default"/>
+      </w:rPr>
+    </w:lvl>
+    <w:lvl w:ilvl="6" w:tplc="04090001" w:tentative="1">
+      <w:start w:val="1"/>
+      <w:numFmt w:val="bullet"/>
+      <w:lvlText w:val=""/>
+      <w:lvlJc w:val="left"/>
+      <w:pPr>
+        <w:ind w:left="4800" w:hanging="480"/>
+      </w:pPr>
+      <w:rPr>
+        <w:rFonts w:ascii="Wingdings" w:hAnsi="Wingdings" w:hint="default"/>
+      </w:rPr>
+    </w:lvl>
+    <w:lvl w:ilvl="7" w:tplc="04090003" w:tentative="1">
+      <w:start w:val="1"/>
+      <w:numFmt w:val="bullet"/>
+      <w:lvlText w:val=""/>
+      <w:lvlJc w:val="left"/>
+      <w:pPr>
+        <w:ind w:left="5280" w:hanging="480"/>
+      </w:pPr>
+      <w:rPr>
+        <w:rFonts w:ascii="Wingdings" w:hAnsi="Wingdings" w:hint="default"/>
+      </w:rPr>
+    </w:lvl>
+    <w:lvl w:ilvl="8" w:tplc="04090005" w:tentative="1">
+      <w:start w:val="1"/>
+      <w:numFmt w:val="bullet"/>
+      <w:lvlText w:val=""/>
+      <w:lvlJc w:val="left"/>
+      <w:pPr>
+        <w:ind w:left="5760" w:hanging="480"/>
+      </w:pPr>
+      <w:rPr>
+        <w:rFonts w:ascii="Wingdings" w:hAnsi="Wingdings" w:hint="default"/>
+      </w:rPr>
+    </w:lvl>
+  </w:abstractNum>
+  <w:abstractNum w:abstractNumId="1" w15:restartNumberingAfterBreak="0">
+    <w:nsid w:val="34E72CFC"/>
+    <w:multiLevelType w:val="hybridMultilevel"/>
+    <w:tmpl w:val="08D4F842"/>
+    <w:lvl w:ilvl="0" w:tplc="04090001">
+      <w:start w:val="1"/>
+      <w:numFmt w:val="bullet"/>
+      <w:lvlText w:val=""/>
+      <w:lvlJc w:val="left"/>
+      <w:pPr>
+        <w:ind w:left="1200" w:hanging="480"/>
+      </w:pPr>
+      <w:rPr>
+        <w:rFonts w:ascii="Wingdings" w:hAnsi="Wingdings" w:hint="default"/>
+      </w:rPr>
+    </w:lvl>
+    <w:lvl w:ilvl="1" w:tplc="04090003" w:tentative="1">
+      <w:start w:val="1"/>
+      <w:numFmt w:val="bullet"/>
+      <w:lvlText w:val=""/>
+      <w:lvlJc w:val="left"/>
+      <w:pPr>
+        <w:ind w:left="1680" w:hanging="480"/>
+      </w:pPr>
+      <w:rPr>
+        <w:rFonts w:ascii="Wingdings" w:hAnsi="Wingdings" w:hint="default"/>
+      </w:rPr>
+    </w:lvl>
+    <w:lvl w:ilvl="2" w:tplc="04090005" w:tentative="1">
+      <w:start w:val="1"/>
+      <w:numFmt w:val="bullet"/>
+      <w:lvlText w:val=""/>
+      <w:lvlJc w:val="left"/>
+      <w:pPr>
+        <w:ind w:left="2160" w:hanging="480"/>
+      </w:pPr>
+      <w:rPr>
+        <w:rFonts w:ascii="Wingdings" w:hAnsi="Wingdings" w:hint="default"/>
+      </w:rPr>
+    </w:lvl>
+    <w:lvl w:ilvl="3" w:tplc="04090001" w:tentative="1">
+      <w:start w:val="1"/>
+      <w:numFmt w:val="bullet"/>
+      <w:lvlText w:val=""/>
+      <w:lvlJc w:val="left"/>
+      <w:pPr>
+        <w:ind w:left="2640" w:hanging="480"/>
+      </w:pPr>
+      <w:rPr>
+        <w:rFonts w:ascii="Wingdings" w:hAnsi="Wingdings" w:hint="default"/>
+      </w:rPr>
+    </w:lvl>
+    <w:lvl w:ilvl="4" w:tplc="04090003" w:tentative="1">
+      <w:start w:val="1"/>
+      <w:numFmt w:val="bullet"/>
+      <w:lvlText w:val=""/>
+      <w:lvlJc w:val="left"/>
+      <w:pPr>
+        <w:ind w:left="3120" w:hanging="480"/>
+      </w:pPr>
+      <w:rPr>
+        <w:rFonts w:ascii="Wingdings" w:hAnsi="Wingdings" w:hint="default"/>
+      </w:rPr>
+    </w:lvl>
+    <w:lvl w:ilvl="5" w:tplc="04090005" w:tentative="1">
+      <w:start w:val="1"/>
+      <w:numFmt w:val="bullet"/>
+      <w:lvlText w:val=""/>
+      <w:lvlJc w:val="left"/>
+      <w:pPr>
+        <w:ind w:left="3600" w:hanging="480"/>
+      </w:pPr>
+      <w:rPr>
+        <w:rFonts w:ascii="Wingdings" w:hAnsi="Wingdings" w:hint="default"/>
+      </w:rPr>
+    </w:lvl>
+    <w:lvl w:ilvl="6" w:tplc="04090001" w:tentative="1">
+      <w:start w:val="1"/>
+      <w:numFmt w:val="bullet"/>
+      <w:lvlText w:val=""/>
+      <w:lvlJc w:val="left"/>
+      <w:pPr>
+        <w:ind w:left="4080" w:hanging="480"/>
+      </w:pPr>
+      <w:rPr>
+        <w:rFonts w:ascii="Wingdings" w:hAnsi="Wingdings" w:hint="default"/>
+      </w:rPr>
+    </w:lvl>
+    <w:lvl w:ilvl="7" w:tplc="04090003" w:tentative="1">
+      <w:start w:val="1"/>
+      <w:numFmt w:val="bullet"/>
+      <w:lvlText w:val=""/>
+      <w:lvlJc w:val="left"/>
+      <w:pPr>
+        <w:ind w:left="4560" w:hanging="480"/>
+      </w:pPr>
+      <w:rPr>
+        <w:rFonts w:ascii="Wingdings" w:hAnsi="Wingdings" w:hint="default"/>
+      </w:rPr>
+    </w:lvl>
+    <w:lvl w:ilvl="8" w:tplc="04090005" w:tentative="1">
+      <w:start w:val="1"/>
+      <w:numFmt w:val="bullet"/>
+      <w:lvlText w:val=""/>
+      <w:lvlJc w:val="left"/>
+      <w:pPr>
+        <w:ind w:left="5040" w:hanging="480"/>
+      </w:pPr>
+      <w:rPr>
+        <w:rFonts w:ascii="Wingdings" w:hAnsi="Wingdings" w:hint="default"/>
+      </w:rPr>
+    </w:lvl>
+  </w:abstractNum>
+  <w:abstractNum w:abstractNumId="2" w15:restartNumberingAfterBreak="0">
+    <w:nsid w:val="7F07158D"/>
+    <w:multiLevelType w:val="hybridMultilevel"/>
+    <w:tmpl w:val="FDB23D2E"/>
+    <w:lvl w:ilvl="0" w:tplc="0409000F">
+      <w:start w:val="1"/>
+      <w:numFmt w:val="decimal"/>
+      <w:lvlText w:val="%1."/>
+      <w:lvlJc w:val="left"/>
+      <w:pPr>
+        <w:ind w:left="1200" w:hanging="480"/>
+      </w:pPr>
+    </w:lvl>
+    <w:lvl w:ilvl="1" w:tplc="04090019" w:tentative="1">
+      <w:start w:val="1"/>
+      <w:numFmt w:val="ideographTraditional"/>
+      <w:lvlText w:val="%2、"/>
+      <w:lvlJc w:val="left"/>
+      <w:pPr>
+        <w:ind w:left="1680" w:hanging="480"/>
+      </w:pPr>
+    </w:lvl>
+    <w:lvl w:ilvl="2" w:tplc="0409001B" w:tentative="1">
+      <w:start w:val="1"/>
+      <w:numFmt w:val="lowerRoman"/>
+      <w:lvlText w:val="%3."/>
+      <w:lvlJc w:val="right"/>
+      <w:pPr>
+        <w:ind w:left="2160" w:hanging="480"/>
+      </w:pPr>
+    </w:lvl>
+    <w:lvl w:ilvl="3" w:tplc="0409000F" w:tentative="1">
+      <w:start w:val="1"/>
+      <w:numFmt w:val="decimal"/>
+      <w:lvlText w:val="%4."/>
+      <w:lvlJc w:val="left"/>
+      <w:pPr>
+        <w:ind w:left="2640" w:hanging="480"/>
+      </w:pPr>
+    </w:lvl>
+    <w:lvl w:ilvl="4" w:tplc="04090019" w:tentative="1">
+      <w:start w:val="1"/>
+      <w:numFmt w:val="ideographTraditional"/>
+      <w:lvlText w:val="%5、"/>
+      <w:lvlJc w:val="left"/>
+      <w:pPr>
+        <w:ind w:left="3120" w:hanging="480"/>
+      </w:pPr>
+    </w:lvl>
+    <w:lvl w:ilvl="5" w:tplc="0409001B" w:tentative="1">
+      <w:start w:val="1"/>
+      <w:numFmt w:val="lowerRoman"/>
+      <w:lvlText w:val="%6."/>
+      <w:lvlJc w:val="right"/>
+      <w:pPr>
+        <w:ind w:left="3600" w:hanging="480"/>
+      </w:pPr>
+    </w:lvl>
+    <w:lvl w:ilvl="6" w:tplc="0409000F" w:tentative="1">
+      <w:start w:val="1"/>
+      <w:numFmt w:val="decimal"/>
+      <w:lvlText w:val="%7."/>
+      <w:lvlJc w:val="left"/>
+      <w:pPr>
+        <w:ind w:left="4080" w:hanging="480"/>
+      </w:pPr>
+    </w:lvl>
+    <w:lvl w:ilvl="7" w:tplc="04090019" w:tentative="1">
+      <w:start w:val="1"/>
+      <w:numFmt w:val="ideographTraditional"/>
+      <w:lvlText w:val="%8、"/>
+      <w:lvlJc w:val="left"/>
+      <w:pPr>
+        <w:ind w:left="4560" w:hanging="480"/>
+      </w:pPr>
+    </w:lvl>
+    <w:lvl w:ilvl="8" w:tplc="0409001B" w:tentative="1">
+      <w:start w:val="1"/>
+      <w:numFmt w:val="lowerRoman"/>
+      <w:lvlText w:val="%9."/>
+      <w:lvlJc w:val="right"/>
+      <w:pPr>
+        <w:ind w:left="5040" w:hanging="480"/>
+      </w:pPr>
+    </w:lvl>
+  </w:abstractNum>
+  <w:num w:numId="1" w16cid:durableId="1453476449">
+    <w:abstractNumId w:val="1"/>
+  </w:num>
+  <w:num w:numId="2" w16cid:durableId="1230771601">
+    <w:abstractNumId w:val="2"/>
+  </w:num>
+  <w:num w:numId="3" w16cid:durableId="522521366">
+    <w:abstractNumId w:val="0"/>
+  </w:num>
+</w:numbering>
 </file>
 
 <file path=word/styles.xml><?xml version="1.0" encoding="utf-8"?>

</xml_diff>